<commit_message>
Tribune et mail : version finale telle qu'adressée à la rédaction
Scissions de phrases et qualité d'associé répercutées dans la source de la
tribune, pitch VF dans le générateur du mail, primeur au mardi 8 septembre,
clôture « Bien à vous, ».

Co-Authored-By: Claude Opus 5 <noreply@anthropic.com>
Claude-Session: https://claude.ai/code/session_01EismpbntstLAG4woJnWJbX
</commit_message>
<xml_diff>
--- a/livrables/Tribune-Dutreil-Carrez/Tribune-Carrez-Ouairy_pour-redaction.docx
+++ b/livrables/Tribune-Dutreil-Carrez/Tribune-Carrez-Ouairy_pour-redaction.docx
@@ -89,7 +89,7 @@
           <w:sz w:val="24"/>
           <w:szCs w:val="24"/>
         </w:rPr>
-        <w:t xml:space="preserve">Rappelons d'où vient ce régime. En 1994, le laboratoire UPSA, fleuron familial d'Agen, passait sous pavillon américain cinq ans après la mort de son dirigeant, droits de succession et ISF aidant. La France taxait alors la transmission en ligne directe jusqu'à 40 %, et moins d'une entreprise sur cinq restait familiale, contre une sur deux en Allemagne. Yvon Gattaz et les entreprises familiales défendent alors l'idée d'un pacte d'actionnaires ; Didier Migaud, rapporteur général socialiste, la fait entrer dans la loi de finances pour 2000 par amendement, avec un abattement de 50 % sur les successions en échange d'un engagement collectif de conservation. Le dispositif fut d'abord connu comme le pacte « Gattaz-Migaud ». La loi Dutreil du 1er août 2003 l'étend aux donations. La loi PME du 2 août 2005 porte l'abattement à 75 %. Le dispositif a été créé sous un gouvernement de gauche, puis étendu par la droite. Nicolas Sarkozy l'a assoupli, François Hollande l'a maintenu intact, et il a encore été simplifié en 2019. Depuis 1999, quatre présidents se sont succédé sans jamais le remettre en cause. L'idée s'était imposée à tous.</w:t>
+        <w:t xml:space="preserve">Rappelons d'où vient ce régime. En 1994, le laboratoire UPSA, fleuron familial d'Agen, passait sous pavillon américain cinq ans après la mort de son dirigeant, droits de succession et ISF aidant. La France taxait alors la transmission en ligne directe jusqu'à 40 %, et moins d'une entreprise sur cinq restait familiale, contre une sur deux en Allemagne. Yvon Gattaz et les entreprises familiales défendent alors l'idée d'un pacte d'actionnaires. Didier Migaud, rapporteur général socialiste, la fait entrer dans la loi de finances pour 2000 par amendement, avec un abattement de 50 % sur les successions en échange d'un engagement collectif de conservation. Le dispositif fut d'abord connu comme le pacte « Gattaz-Migaud ». La loi Dutreil du 1er août 2003 l'étend aux donations. La loi PME du 2 août 2005 porte l'abattement à 75 %. Le dispositif a été créé sous un gouvernement de gauche, puis étendu par la droite. Nicolas Sarkozy l'a assoupli, François Hollande l'a maintenu intact, et il a encore été simplifié en 2019. Depuis 1999, quatre présidents se sont succédé sans jamais le remettre en cause. L'idée s'était imposée à tous.</w:t>
       </w:r>
     </w:p>
     <w:p>
@@ -197,7 +197,7 @@
           <w:sz w:val="24"/>
           <w:szCs w:val="24"/>
         </w:rPr>
-        <w:t xml:space="preserve">Il ne faut ni raboter ni sanctuariser. Le rabot frapperait à côté ; le statu quo laisserait prospérer ce que la Cour documente. D'abord, ce que les fiscalistes appellent une clause de grand-père. Un pacte signé est un contrat, et un contrat oblige les deux parties. Les familles tiennent huit ans ; l'État doit tenir les règles en vigueur au jour de la signature, jusqu'au terme, pour tous les pactes en cours. Son coût budgétaire est nul. Aux pactes nouveaux, la loi fixera les conditions qu'elle voudra, et le taux de 75 % sera maintenu. Ensuite, achever le ciblage. Les biens de confort viennent de sortir de l'assiette. La trésorerie de placement et l'immobilier de rapport y restent. Le même mécanisme, étendu à ces actifs, donnerait au régime sa forme aboutie, 75 % sans plafond pour l'outil professionnel réellement transmis et dirigé, au besoin assorti d'engagements sur l'emploi, rien pour le reste. Ce ciblage rapporterait davantage qu'une baisse de taux, et il répond à la question d'équité par la structure même du régime. Enfin une évaluation publique et indépendante tous les trois ans, seule occasion de retoucher le dispositif. La matière statistique existe, le travail de la Cour et de l'Institut des politiques publiques vient de le montrer. Il manque le rendez-vous.</w:t>
+        <w:t xml:space="preserve">Il ne faut ni raboter ni sanctuariser. Le rabot frapperait à côté. Le statu quo laisserait prospérer ce que la Cour documente. D'abord, ce que les fiscalistes appellent une clause de grand-père. Un pacte signé est un contrat, et un contrat oblige les deux parties. Les familles tiennent huit ans ; l'État doit tenir les règles en vigueur au jour de la signature, jusqu'au terme, pour tous les pactes en cours. Son coût budgétaire est nul. Aux pactes nouveaux, la loi fixera les conditions qu'elle voudra, et le taux de 75 % sera maintenu. Ensuite, achever le ciblage. Les biens de confort viennent de sortir de l'assiette. La trésorerie de placement et l'immobilier de rapport y restent. Le même mécanisme, étendu à ces actifs, donnerait au régime sa forme aboutie, 75 % sans plafond pour l'outil professionnel réellement transmis et dirigé, au besoin assorti d'engagements sur l'emploi, rien pour le reste. Ce ciblage rapporterait davantage qu'une baisse de taux, et il répond à la question d'équité par la structure même du régime. Enfin une évaluation publique et indépendante tous les trois ans, seule occasion de retoucher le dispositif. La matière statistique existe, le travail de la Cour et de l'Institut des politiques publiques vient de le montrer. Il manque le rendez-vous.</w:t>
       </w:r>
     </w:p>
     <w:p>
@@ -233,7 +233,7 @@
           <w:sz w:val="24"/>
           <w:szCs w:val="24"/>
         </w:rPr>
-        <w:t xml:space="preserve">Gilles Carrez, ancien rapporteur général du budget, ancien président de la commission des finances de l'Assemblée nationale, et François Ouairy, avocat fiscaliste (BENSAID Avocats)</w:t>
+        <w:t xml:space="preserve">Gilles Carrez, ancien rapporteur général du budget, ancien président de la commission des finances de l'Assemblée nationale, et François Ouairy, avocat fiscaliste associé (BENSAID Avocats)</w:t>
       </w:r>
     </w:p>
     <w:sectPr>

</xml_diff>

<commit_message>
Tribune : attributions de sources explicitées dans le texte
Statistique de transmission familiale rattachée aux rapports parlementaires
de l'époque, exemple chiffré présenté comme un calcul au barème en vigueur.
Réponse au Monde mise à jour en conséquence.

Co-Authored-By: Claude Opus 5 <noreply@anthropic.com>
Claude-Session: https://claude.ai/code/session_01EismpbntstLAG4woJnWJbX
</commit_message>
<xml_diff>
--- a/livrables/Tribune-Dutreil-Carrez/Tribune-Carrez-Ouairy_pour-redaction.docx
+++ b/livrables/Tribune-Dutreil-Carrez/Tribune-Carrez-Ouairy_pour-redaction.docx
@@ -89,25 +89,25 @@
           <w:sz w:val="24"/>
           <w:szCs w:val="24"/>
         </w:rPr>
-        <w:t xml:space="preserve">Rappelons d'où vient ce régime. En 1994, le laboratoire UPSA, fleuron familial d'Agen, passait sous pavillon américain cinq ans après la mort de son dirigeant, droits de succession et ISF aidant. La France taxait alors la transmission en ligne directe jusqu'à 40 %, et moins d'une entreprise sur cinq restait familiale, contre une sur deux en Allemagne. Yvon Gattaz et les entreprises familiales défendent alors l'idée d'un pacte d'actionnaires. Didier Migaud, rapporteur général socialiste, la fait entrer dans la loi de finances pour 2000 par amendement, avec un abattement de 50 % sur les successions en échange d'un engagement collectif de conservation. Le dispositif fut d'abord connu comme le pacte « Gattaz-Migaud ». La loi Dutreil du 1er août 2003 l'étend aux donations. La loi PME du 2 août 2005 porte l'abattement à 75 %. Le dispositif a été créé sous un gouvernement de gauche, puis étendu par la droite. Nicolas Sarkozy l'a assoupli, François Hollande l'a maintenu intact, et il a encore été simplifié en 2019. Depuis 1999, quatre présidents se sont succédé sans jamais le remettre en cause. L'idée s'était imposée à tous.</w:t>
-      </w:r>
-    </w:p>
-    <w:p>
-      <w:pPr>
-        <w:spacing w:after="200" w:before="0" w:line="360"/>
-        <w:jc w:val="both"/>
-      </w:pPr>
-      <w:r>
-        <w:rPr>
-          <w:rFonts w:ascii="Times New Roman" w:cs="Times New Roman" w:eastAsia="Times New Roman" w:hAnsi="Times New Roman"/>
-          <w:b w:val="false"/>
-          <w:bCs w:val="false"/>
-          <w:i w:val="false"/>
-          <w:iCs w:val="false"/>
-          <w:sz w:val="24"/>
-          <w:szCs w:val="24"/>
-        </w:rPr>
-        <w:t xml:space="preserve">L'ordre de grandeur mérite d'être posé. Pour une entreprise valorisée vingt millions d'euros et un enfant repreneur, les droits au décès, sans pacte, atteignent de l'ordre de huit millions d'euros. Avec un pacte, ils retombent autour de deux millions. Peu d'héritiers disposent de huit millions d'euros immédiatement mobilisables. Ils empruntent, ponctionnent la trésorerie de l'entreprise, ou vendent. La loi de finances du 19 février 2026 a d'ailleurs durci l'exercice. L'engagement est porté à huit ans au total, et la fraction de valeur correspondant notamment aux résidences, yachts ou œuvres d'art étrangers à l'exploitation sort désormais de l'assiette exonérée. Ces règles ont quelques mois. Personne n'en a mesuré les effets. En écrire de nouvelles dès cet automne, c'est légiférer à l'aveugle.</w:t>
+        <w:t xml:space="preserve">Rappelons d'où vient ce régime. En 1994, le laboratoire UPSA, fleuron familial d'Agen, passait sous pavillon américain cinq ans après la mort de son dirigeant, droits de succession et ISF aidant. La France taxait alors la transmission en ligne directe jusqu'à 40 %. Selon les rapports parlementaires de l'époque, moins d'une entreprise sur cinq restait familiale, contre une sur deux en Allemagne. Yvon Gattaz et les entreprises familiales défendent alors l'idée d'un pacte d'actionnaires. Didier Migaud, rapporteur général socialiste, la fait entrer dans la loi de finances pour 2000 par amendement, avec un abattement de 50 % sur les successions en échange d'un engagement collectif de conservation. Le dispositif fut d'abord connu comme le pacte « Gattaz-Migaud ». La loi Dutreil du 1er août 2003 l'étend aux donations. La loi PME du 2 août 2005 porte l'abattement à 75 %. Le dispositif a été créé sous un gouvernement de gauche, puis étendu par la droite. Nicolas Sarkozy l'a assoupli, François Hollande l'a maintenu intact, et il a encore été simplifié en 2019. Depuis 1999, quatre présidents se sont succédé sans jamais le remettre en cause. L'idée s'était imposée à tous.</w:t>
+      </w:r>
+    </w:p>
+    <w:p>
+      <w:pPr>
+        <w:spacing w:after="200" w:before="0" w:line="360"/>
+        <w:jc w:val="both"/>
+      </w:pPr>
+      <w:r>
+        <w:rPr>
+          <w:rFonts w:ascii="Times New Roman" w:cs="Times New Roman" w:eastAsia="Times New Roman" w:hAnsi="Times New Roman"/>
+          <w:b w:val="false"/>
+          <w:bCs w:val="false"/>
+          <w:i w:val="false"/>
+          <w:iCs w:val="false"/>
+          <w:sz w:val="24"/>
+          <w:szCs w:val="24"/>
+        </w:rPr>
+        <w:t xml:space="preserve">L'ordre de grandeur mérite d'être posé. Au barème en vigueur, pour une entreprise valorisée vingt millions d'euros et un enfant repreneur, les droits au décès, sans pacte, atteignent de l'ordre de huit millions d'euros. Avec un pacte, ils retombent autour de deux millions. Peu d'héritiers disposent de huit millions d'euros immédiatement mobilisables. Ils empruntent, ponctionnent la trésorerie de l'entreprise, ou vendent. La loi de finances du 19 février 2026 a d'ailleurs durci l'exercice. L'engagement est porté à huit ans au total, et la fraction de valeur correspondant notamment aux résidences, yachts ou œuvres d'art étrangers à l'exploitation sort désormais de l'assiette exonérée. Ces règles ont quelques mois. Personne n'en a mesuré les effets. En écrire de nouvelles dès cet automne, c'est légiférer à l'aveugle.</w:t>
       </w:r>
     </w:p>
     <w:p>

</xml_diff>